<commit_message>
final updates, ready for release
</commit_message>
<xml_diff>
--- a/manuscript/manuscript.docx
+++ b/manuscript/manuscript.docx
@@ -511,19 +511,19 @@
         <w:rPr>
           <w:rFonts w:ascii="Times New Roman" w:hAnsi="Times New Roman" w:cs="Times New Roman"/>
         </w:rPr>
-        <w:t xml:space="preserve"> or generosity</w:t>
-      </w:r>
-      <w:r>
-        <w:rPr>
-          <w:rFonts w:ascii="Times New Roman" w:hAnsi="Times New Roman" w:cs="Times New Roman"/>
-        </w:rPr>
         <w:t xml:space="preserve">, to more toxic </w:t>
       </w:r>
       <w:r>
         <w:rPr>
           <w:rFonts w:ascii="Times New Roman" w:hAnsi="Times New Roman" w:cs="Times New Roman"/>
         </w:rPr>
-        <w:t xml:space="preserve">forms like </w:t>
+        <w:t>ones</w:t>
+      </w:r>
+      <w:r>
+        <w:rPr>
+          <w:rFonts w:ascii="Times New Roman" w:hAnsi="Times New Roman" w:cs="Times New Roman"/>
+        </w:rPr>
+        <w:t xml:space="preserve"> like </w:t>
       </w:r>
       <w:r>
         <w:rPr>
@@ -641,7 +641,7 @@
         <w:rPr>
           <w:rFonts w:ascii="Times New Roman" w:hAnsi="Times New Roman" w:cs="Times New Roman"/>
         </w:rPr>
-        <w:t>gaps and make processes explicit. W</w:t>
+        <w:t>gaps. W</w:t>
       </w:r>
       <w:r>
         <w:rPr>
@@ -916,7 +916,7 @@
         <w:rPr>
           <w:rFonts w:ascii="Times New Roman" w:hAnsi="Times New Roman" w:cs="Times New Roman"/>
         </w:rPr>
-        <w:t>a form of t</w:t>
+        <w:t>t</w:t>
       </w:r>
       <w:r>
         <w:rPr>
@@ -928,36 +928,19 @@
         <w:rPr>
           <w:rFonts w:ascii="Times New Roman" w:hAnsi="Times New Roman" w:cs="Times New Roman"/>
         </w:rPr>
+        <w:t xml:space="preserve"> (TOD)</w:t>
+      </w:r>
+      <w:r>
+        <w:rPr>
+          <w:rFonts w:ascii="Times New Roman" w:hAnsi="Times New Roman" w:cs="Times New Roman"/>
+        </w:rPr>
         <w:t xml:space="preserve">. </w:t>
       </w:r>
       <w:r>
         <w:rPr>
           <w:rFonts w:ascii="Times New Roman" w:hAnsi="Times New Roman" w:cs="Times New Roman"/>
         </w:rPr>
-        <w:t xml:space="preserve">It refers to the negative, harmful behavioral aspects that occur as </w:t>
-      </w:r>
-      <w:commentRangeStart w:id="0"/>
-      <w:r>
-        <w:rPr>
-          <w:rFonts w:ascii="Times New Roman" w:hAnsi="Times New Roman" w:cs="Times New Roman"/>
-        </w:rPr>
-        <w:t xml:space="preserve">a consequence of characteristics of the online </w:t>
-      </w:r>
-      <w:commentRangeEnd w:id="0"/>
-      <w:r>
-        <w:rPr>
-          <w:rStyle w:val="Kommentarzeichen"/>
-          <w:rFonts w:ascii="Times New Roman" w:hAnsi="Times New Roman" w:cs="Times New Roman"/>
-          <w:sz w:val="24"/>
-          <w:szCs w:val="24"/>
-        </w:rPr>
-        <w:commentReference w:id="0"/>
-      </w:r>
-      <w:r>
-        <w:rPr>
-          <w:rFonts w:ascii="Times New Roman" w:hAnsi="Times New Roman" w:cs="Times New Roman"/>
-        </w:rPr>
-        <w:t xml:space="preserve">environment </w:t>
+        <w:t xml:space="preserve">It refers to the negative, harmful behavioral aspects that occur as a consequence of characteristics of the online environment </w:t>
       </w:r>
       <w:r>
         <w:rPr>
@@ -993,7 +976,19 @@
         <w:rPr>
           <w:rFonts w:ascii="Times New Roman" w:hAnsi="Times New Roman" w:cs="Times New Roman"/>
         </w:rPr>
-        <w:t>. To my knowledge, no meta-analysis has addressed this phenomenon to date. To assess robustness, I will focus on two experimental studies. This limits the strength of evidence, as this limited data might be biased, most likely misses aspects reported in other studies and lacks statistical quantification.</w:t>
+        <w:t>. To my knowledge, no meta-analysis has addressed this phenomenon to date. To assess robustness, I will focus on two experimental studies. This limits the strength of evidence, as this limited data might be biased, most likely misses aspects reported in other studies</w:t>
+      </w:r>
+      <w:r>
+        <w:rPr>
+          <w:rFonts w:ascii="Times New Roman" w:hAnsi="Times New Roman" w:cs="Times New Roman"/>
+        </w:rPr>
+        <w:t>,</w:t>
+      </w:r>
+      <w:r>
+        <w:rPr>
+          <w:rFonts w:ascii="Times New Roman" w:hAnsi="Times New Roman" w:cs="Times New Roman"/>
+        </w:rPr>
+        <w:t xml:space="preserve"> and lacks statistical quantification.</w:t>
       </w:r>
     </w:p>
     <w:p>
@@ -1045,7 +1040,19 @@
         <w:rPr>
           <w:rFonts w:ascii="Times New Roman" w:hAnsi="Times New Roman" w:cs="Times New Roman"/>
         </w:rPr>
-        <w:t>. Regarding different units, the studies assessed toxic online disinhibition within student populations only. However, the effect was found in two different cultures and for both male and female participants of different ages. Both studies used similar treatment conditions</w:t>
+        <w:t xml:space="preserve">. Regarding different units, the studies assessed </w:t>
+      </w:r>
+      <w:r>
+        <w:rPr>
+          <w:rFonts w:ascii="Times New Roman" w:hAnsi="Times New Roman" w:cs="Times New Roman"/>
+        </w:rPr>
+        <w:t>TOD</w:t>
+      </w:r>
+      <w:r>
+        <w:rPr>
+          <w:rFonts w:ascii="Times New Roman" w:hAnsi="Times New Roman" w:cs="Times New Roman"/>
+        </w:rPr>
+        <w:t xml:space="preserve"> within student populations only. However, the effect was found in two different cultures and for both male and female participants of different ages. Both studies used similar treatment conditions</w:t>
       </w:r>
       <w:r>
         <w:rPr>
@@ -1075,7 +1082,31 @@
         <w:rPr>
           <w:rFonts w:ascii="Times New Roman" w:hAnsi="Times New Roman" w:cs="Times New Roman"/>
         </w:rPr>
-        <w:t xml:space="preserve">the anonymity level (high vs. low). Lapidot-Lefler and Barak additionally varied the level of visibility and eye contact. The outcome, i.e. toxic online disinhibition, was operationalized and measured differently. </w:t>
+        <w:t xml:space="preserve">the anonymity level (high vs. low). Lapidot-Lefler and Barak additionally varied the level of visibility and eye contact. The outcome, i.e. </w:t>
+      </w:r>
+      <w:r>
+        <w:rPr>
+          <w:rFonts w:ascii="Times New Roman" w:hAnsi="Times New Roman" w:cs="Times New Roman"/>
+        </w:rPr>
+        <w:t>TOD</w:t>
+      </w:r>
+      <w:r>
+        <w:rPr>
+          <w:rFonts w:ascii="Times New Roman" w:hAnsi="Times New Roman" w:cs="Times New Roman"/>
+        </w:rPr>
+        <w:t>, was operationalized and measured differently</w:t>
+      </w:r>
+      <w:r>
+        <w:rPr>
+          <w:rFonts w:ascii="Times New Roman" w:hAnsi="Times New Roman" w:cs="Times New Roman"/>
+        </w:rPr>
+        <w:t>:</w:t>
+      </w:r>
+      <w:r>
+        <w:rPr>
+          <w:rFonts w:ascii="Times New Roman" w:hAnsi="Times New Roman" w:cs="Times New Roman"/>
+        </w:rPr>
+        <w:t xml:space="preserve"> </w:t>
       </w:r>
       <w:r>
         <w:rPr>
@@ -1147,56 +1178,62 @@
         <w:rPr>
           <w:rFonts w:ascii="Times New Roman" w:hAnsi="Times New Roman" w:cs="Times New Roman"/>
         </w:rPr>
-        <w:t xml:space="preserve">ifferent communication channels </w:t>
+        <w:t xml:space="preserve">ifferent communication channels were used between the studies. </w:t>
+      </w:r>
+      <w:r>
+        <w:rPr>
+          <w:rFonts w:ascii="Times New Roman" w:hAnsi="Times New Roman" w:cs="Times New Roman"/>
+        </w:rPr>
+        <w:fldChar w:fldCharType="begin"/>
+      </w:r>
+      <w:r>
+        <w:rPr>
+          <w:rFonts w:ascii="Times New Roman" w:hAnsi="Times New Roman" w:cs="Times New Roman"/>
+        </w:rPr>
+        <w:instrText xml:space="preserve"> ADDIN ZOTERO_ITEM CSL_CITATION {"citationID":"aJMB8YOe","properties":{"formattedCitation":"(Nitschinsk et al., 2022)","plainCitation":"(Nitschinsk et al., 2022)","noteIndex":0},"citationItems":[{"id":1790,"uris":["http://zotero.org/users/12960128/items/BUZZIC58"],"itemData":{"id":1790,"type":"article-journal","abstract":"Research assessing online trolling—a behavior designed to trigger or antagonize other users for entertainment—has largely focused on identifying individual differences that underlie the behavior. Less attention has been given to how situational factors inﬂuence trolling, such as the disinhibiting effects of anonymity. In this study, we evaluated the roles of both individual differences and levels of anonymity in online trolling. We assessed these through experimentation, a relatively novel approach in trolling research. Australian undergraduate students (n = 242, 167 women, 75 men, Mage = 21.18) were allocated to one of three conditions: an anonymous condition where they were not visible to one another, an identiﬁable condition where they were visible to one another, or an external condition where they completed the study outside of a controlled laboratory environment. Participants ﬁrst read a short news article before interacting in an online group discussion where participants could chat freely. The ﬁrst comment participants wrote was later coded for trolling. Participants also completed assessments of psychopathy, sadism, and a global assessment of trolling. As predicted, participants in the anonymous condition trolled more than those in the identiﬁable condition. No differences were seen between these two conditions and the external condition. Analyses also revealed that sadism and global trolling were positively associated with trolling in the chat room, but psychopathy showed no association. These results demonstrate the importance of both individual differences and the disinhibiting effects of anonymity when investigating the complex nature of trolling.","citation-key":"nitschinskDisinhibitingEffectsAnonymity2022","container-title":"Cyberpsychology, Behavior, and Social Networking","DOI":"10.1089/cyber.2022.0005","ISSN":"2152-2715, 2152-2723","issue":"6","journalAbbreviation":"Cyberpsychology, Behavior, and Social Networking","language":"en","license":"https://www.liebertpub.com/nv/resources-tools/text-and-data-mining-policy/121/","page":"377-383","source":"DOI.org (Crossref)","title":"The Disinhibiting Effects of Anonymity Increase Online Trolling","volume":"25","author":[{"family":"Nitschinsk","given":"Lewis"},{"family":"Tobin","given":"Stephanie J."},{"family":"Vanman","given":"Eric J."}],"issued":{"date-parts":[["2022",6,1]]}}}],"schema":"https://github.com/citation-style-language/schema/raw/master/csl-citation.json"} </w:instrText>
+      </w:r>
+      <w:r>
+        <w:rPr>
+          <w:rFonts w:ascii="Times New Roman" w:hAnsi="Times New Roman" w:cs="Times New Roman"/>
+        </w:rPr>
+        <w:fldChar w:fldCharType="separate"/>
+      </w:r>
+      <w:r>
+        <w:rPr>
+          <w:rFonts w:ascii="Times New Roman" w:hAnsi="Times New Roman" w:cs="Times New Roman"/>
+        </w:rPr>
+        <w:t>Nitschinsk et al.</w:t>
+      </w:r>
+      <w:r>
+        <w:rPr>
+          <w:rFonts w:ascii="Times New Roman" w:hAnsi="Times New Roman" w:cs="Times New Roman"/>
+        </w:rPr>
+        <w:t xml:space="preserve"> </w:t>
+      </w:r>
+      <w:r>
+        <w:rPr>
+          <w:rFonts w:ascii="Times New Roman" w:hAnsi="Times New Roman" w:cs="Times New Roman"/>
+        </w:rPr>
+        <w:fldChar w:fldCharType="end"/>
+      </w:r>
+      <w:r>
+        <w:rPr>
+          <w:rFonts w:ascii="Times New Roman" w:hAnsi="Times New Roman" w:cs="Times New Roman"/>
+        </w:rPr>
+        <w:t>also</w:t>
+      </w:r>
+      <w:r>
+        <w:rPr>
+          <w:rFonts w:ascii="Times New Roman" w:hAnsi="Times New Roman" w:cs="Times New Roman"/>
+        </w:rPr>
+        <w:t xml:space="preserve"> </w:t>
       </w:r>
       <w:r>
         <w:rPr>
           <w:rFonts w:ascii="Times New Roman" w:hAnsi="Times New Roman" w:cs="Times New Roman"/>
         </w:rPr>
         <w:lastRenderedPageBreak/>
-        <w:t xml:space="preserve">were used between the studies. </w:t>
-      </w:r>
-      <w:r>
-        <w:rPr>
-          <w:rFonts w:ascii="Times New Roman" w:hAnsi="Times New Roman" w:cs="Times New Roman"/>
-        </w:rPr>
-        <w:fldChar w:fldCharType="begin"/>
-      </w:r>
-      <w:r>
-        <w:rPr>
-          <w:rFonts w:ascii="Times New Roman" w:hAnsi="Times New Roman" w:cs="Times New Roman"/>
-        </w:rPr>
-        <w:instrText xml:space="preserve"> ADDIN ZOTERO_ITEM CSL_CITATION {"citationID":"aJMB8YOe","properties":{"formattedCitation":"(Nitschinsk et al., 2022)","plainCitation":"(Nitschinsk et al., 2022)","noteIndex":0},"citationItems":[{"id":1790,"uris":["http://zotero.org/users/12960128/items/BUZZIC58"],"itemData":{"id":1790,"type":"article-journal","abstract":"Research assessing online trolling—a behavior designed to trigger or antagonize other users for entertainment—has largely focused on identifying individual differences that underlie the behavior. Less attention has been given to how situational factors inﬂuence trolling, such as the disinhibiting effects of anonymity. In this study, we evaluated the roles of both individual differences and levels of anonymity in online trolling. We assessed these through experimentation, a relatively novel approach in trolling research. Australian undergraduate students (n = 242, 167 women, 75 men, Mage = 21.18) were allocated to one of three conditions: an anonymous condition where they were not visible to one another, an identiﬁable condition where they were visible to one another, or an external condition where they completed the study outside of a controlled laboratory environment. Participants ﬁrst read a short news article before interacting in an online group discussion where participants could chat freely. The ﬁrst comment participants wrote was later coded for trolling. Participants also completed assessments of psychopathy, sadism, and a global assessment of trolling. As predicted, participants in the anonymous condition trolled more than those in the identiﬁable condition. No differences were seen between these two conditions and the external condition. Analyses also revealed that sadism and global trolling were positively associated with trolling in the chat room, but psychopathy showed no association. These results demonstrate the importance of both individual differences and the disinhibiting effects of anonymity when investigating the complex nature of trolling.","citation-key":"nitschinskDisinhibitingEffectsAnonymity2022","container-title":"Cyberpsychology, Behavior, and Social Networking","DOI":"10.1089/cyber.2022.0005","ISSN":"2152-2715, 2152-2723","issue":"6","journalAbbreviation":"Cyberpsychology, Behavior, and Social Networking","language":"en","license":"https://www.liebertpub.com/nv/resources-tools/text-and-data-mining-policy/121/","page":"377-383","source":"DOI.org (Crossref)","title":"The Disinhibiting Effects of Anonymity Increase Online Trolling","volume":"25","author":[{"family":"Nitschinsk","given":"Lewis"},{"family":"Tobin","given":"Stephanie J."},{"family":"Vanman","given":"Eric J."}],"issued":{"date-parts":[["2022",6,1]]}}}],"schema":"https://github.com/citation-style-language/schema/raw/master/csl-citation.json"} </w:instrText>
-      </w:r>
-      <w:r>
-        <w:rPr>
-          <w:rFonts w:ascii="Times New Roman" w:hAnsi="Times New Roman" w:cs="Times New Roman"/>
-        </w:rPr>
-        <w:fldChar w:fldCharType="separate"/>
-      </w:r>
-      <w:r>
-        <w:rPr>
-          <w:rFonts w:ascii="Times New Roman" w:hAnsi="Times New Roman" w:cs="Times New Roman"/>
-        </w:rPr>
-        <w:t>Nitschinsk et al.</w:t>
-      </w:r>
-      <w:r>
-        <w:rPr>
-          <w:rFonts w:ascii="Times New Roman" w:hAnsi="Times New Roman" w:cs="Times New Roman"/>
-        </w:rPr>
-        <w:t xml:space="preserve"> </w:t>
-      </w:r>
-      <w:r>
-        <w:rPr>
-          <w:rFonts w:ascii="Times New Roman" w:hAnsi="Times New Roman" w:cs="Times New Roman"/>
-        </w:rPr>
-        <w:fldChar w:fldCharType="end"/>
-      </w:r>
-      <w:r>
-        <w:rPr>
-          <w:rFonts w:ascii="Times New Roman" w:hAnsi="Times New Roman" w:cs="Times New Roman"/>
-        </w:rPr>
-        <w:t xml:space="preserve">additionally added a condition for participation outside of the laboratory, which did not show the expected effect. </w:t>
+        <w:t xml:space="preserve">added a condition for participation outside of the laboratory, which did not show the expected effect. </w:t>
       </w:r>
     </w:p>
     <w:p>
@@ -1214,7 +1251,6 @@
         </w:rPr>
         <w:t xml:space="preserve">Within the scope of this assessment, the phenomenon can be said to be generalizable across different units and outcomes. For treatments and settings, generalizability is lower, as there is less variation within and between studies. Keeping the limited strength of evidence in mind, the phenomenon cannot be said to be robust. </w:t>
       </w:r>
-      <w:commentRangeStart w:id="1"/>
       <w:r>
         <w:rPr>
           <w:rFonts w:ascii="Times New Roman" w:hAnsi="Times New Roman" w:cs="Times New Roman"/>
@@ -1286,16 +1322,6 @@
           <w:rFonts w:ascii="Times New Roman" w:hAnsi="Times New Roman" w:cs="Times New Roman"/>
         </w:rPr>
         <w:t xml:space="preserve"> </w:t>
-      </w:r>
-      <w:commentRangeEnd w:id="1"/>
-      <w:r>
-        <w:rPr>
-          <w:rStyle w:val="Kommentarzeichen"/>
-          <w:rFonts w:ascii="Times New Roman" w:hAnsi="Times New Roman" w:cs="Times New Roman"/>
-          <w:sz w:val="24"/>
-          <w:szCs w:val="24"/>
-        </w:rPr>
-        <w:commentReference w:id="1"/>
       </w:r>
     </w:p>
     <w:p>
@@ -2146,7 +2172,7 @@
                     <pic:cNvPicPr/>
                   </pic:nvPicPr>
                   <pic:blipFill>
-                    <a:blip r:embed="rId11">
+                    <a:blip r:embed="rId7">
                       <a:extLst>
                         <a:ext uri="{28A0092B-C50C-407E-A947-70E740481C1C}">
                           <a14:useLocalDpi xmlns:a14="http://schemas.microsoft.com/office/drawing/2010/main" val="0"/>
@@ -3644,7 +3670,7 @@
           <w:rFonts w:ascii="Times New Roman" w:hAnsi="Times New Roman" w:cs="Times New Roman"/>
         </w:rPr>
         <w:sectPr>
-          <w:headerReference w:type="default" r:id="rId12"/>
+          <w:headerReference w:type="default" r:id="rId8"/>
           <w:pgSz w:w="11906" w:h="16838"/>
           <w:pgMar w:top="1304" w:right="1418" w:bottom="1021" w:left="1418" w:header="709" w:footer="709" w:gutter="0"/>
           <w:cols w:space="708"/>
@@ -6473,7 +6499,7 @@
                           </pic:cNvPicPr>
                         </pic:nvPicPr>
                         <pic:blipFill>
-                          <a:blip r:embed="rId13" cstate="print">
+                          <a:blip r:embed="rId9" cstate="print">
                             <a:extLst>
                               <a:ext uri="{28A0092B-C50C-407E-A947-70E740481C1C}">
                                 <a14:useLocalDpi xmlns:a14="http://schemas.microsoft.com/office/drawing/2010/main" val="0"/>
@@ -6507,7 +6533,7 @@
                           </pic:cNvPicPr>
                         </pic:nvPicPr>
                         <pic:blipFill>
-                          <a:blip r:embed="rId14" cstate="print">
+                          <a:blip r:embed="rId10" cstate="print">
                             <a:extLst>
                               <a:ext uri="{28A0092B-C50C-407E-A947-70E740481C1C}">
                                 <a14:useLocalDpi xmlns:a14="http://schemas.microsoft.com/office/drawing/2010/main" val="0"/>
@@ -6541,7 +6567,7 @@
                           </pic:cNvPicPr>
                         </pic:nvPicPr>
                         <pic:blipFill>
-                          <a:blip r:embed="rId15" cstate="print">
+                          <a:blip r:embed="rId11" cstate="print">
                             <a:extLst>
                               <a:ext uri="{28A0092B-C50C-407E-A947-70E740481C1C}">
                                 <a14:useLocalDpi xmlns:a14="http://schemas.microsoft.com/office/drawing/2010/main" val="0"/>
@@ -6575,7 +6601,7 @@
                           </pic:cNvPicPr>
                         </pic:nvPicPr>
                         <pic:blipFill>
-                          <a:blip r:embed="rId16" cstate="print">
+                          <a:blip r:embed="rId12" cstate="print">
                             <a:extLst>
                               <a:ext uri="{28A0092B-C50C-407E-A947-70E740481C1C}">
                                 <a14:useLocalDpi xmlns:a14="http://schemas.microsoft.com/office/drawing/2010/main" val="0"/>
@@ -7117,7 +7143,6 @@
           <w:bCs/>
         </w:rPr>
       </w:pPr>
-      <w:commentRangeStart w:id="2"/>
       <w:r>
         <w:rPr>
           <w:rFonts w:ascii="Times New Roman" w:hAnsi="Times New Roman" w:cs="Times New Roman"/>
@@ -7125,18 +7150,6 @@
           <w:bCs/>
         </w:rPr>
         <w:t>Evaluation of the Formal Model</w:t>
-      </w:r>
-      <w:commentRangeEnd w:id="2"/>
-      <w:r>
-        <w:rPr>
-          <w:rStyle w:val="Kommentarzeichen"/>
-          <w:rFonts w:ascii="Times New Roman" w:hAnsi="Times New Roman" w:cs="Times New Roman"/>
-          <w:b/>
-          <w:bCs/>
-          <w:sz w:val="24"/>
-          <w:szCs w:val="24"/>
-        </w:rPr>
-        <w:commentReference w:id="2"/>
       </w:r>
     </w:p>
     <w:p>
@@ -7223,6 +7236,8 @@
       <w:r>
         <w:rPr>
           <w:rFonts w:ascii="Times New Roman" w:hAnsi="Times New Roman" w:cs="Times New Roman"/>
+          <w:i/>
+          <w:iCs/>
         </w:rPr>
         <w:t>N</w:t>
       </w:r>
@@ -7656,6 +7671,20 @@
           <w:i/>
         </w:rPr>
         <w:t>ondition</w:t>
+      </w:r>
+      <w:r>
+        <w:rPr>
+          <w:rFonts w:ascii="Times New Roman" w:hAnsi="Times New Roman" w:cs="Times New Roman"/>
+          <w:i/>
+        </w:rPr>
+        <w:t xml:space="preserve"> </w:t>
+      </w:r>
+      <w:r>
+        <w:rPr>
+          <w:rFonts w:ascii="Times New Roman" w:hAnsi="Times New Roman" w:cs="Times New Roman"/>
+          <w:i/>
+        </w:rPr>
+        <w:t>(n = 35)</w:t>
       </w:r>
     </w:p>
     <w:p>
@@ -7952,7 +7981,15 @@
         <w:rPr>
           <w:rFonts w:ascii="Times New Roman" w:hAnsi="Times New Roman" w:cs="Times New Roman"/>
         </w:rPr>
-        <w:t xml:space="preserve"> curse words (R</w:t>
+        <w:t xml:space="preserve"> curse words (</w:t>
+      </w:r>
+      <w:r>
+        <w:rPr>
+          <w:rFonts w:ascii="Times New Roman" w:hAnsi="Times New Roman" w:cs="Times New Roman"/>
+          <w:i/>
+          <w:iCs/>
+        </w:rPr>
+        <w:t>R</w:t>
       </w:r>
       <w:r>
         <w:rPr>
@@ -8497,7 +8534,7 @@
         <w:rPr>
           <w:rFonts w:ascii="Times New Roman" w:hAnsi="Times New Roman" w:cs="Times New Roman"/>
         </w:rPr>
-        <w:t>0.01</w:t>
+        <w:t>.01</w:t>
       </w:r>
       <w:r>
         <w:rPr>
@@ -8556,6 +8593,8 @@
       <w:r>
         <w:rPr>
           <w:rFonts w:ascii="Times New Roman" w:hAnsi="Times New Roman" w:cs="Times New Roman"/>
+          <w:i/>
+          <w:iCs/>
         </w:rPr>
         <w:t>p</w:t>
       </w:r>
@@ -8581,7 +8620,21 @@
         <w:rPr>
           <w:rFonts w:ascii="Times New Roman" w:hAnsi="Times New Roman" w:cs="Times New Roman"/>
         </w:rPr>
-        <w:t xml:space="preserve">The interaction effect was not significant (p </w:t>
+        <w:t>The interaction effect was not significant (</w:t>
+      </w:r>
+      <w:r>
+        <w:rPr>
+          <w:rFonts w:ascii="Times New Roman" w:hAnsi="Times New Roman" w:cs="Times New Roman"/>
+          <w:i/>
+          <w:iCs/>
+        </w:rPr>
+        <w:t>p</w:t>
+      </w:r>
+      <w:r>
+        <w:rPr>
+          <w:rFonts w:ascii="Times New Roman" w:hAnsi="Times New Roman" w:cs="Times New Roman"/>
+        </w:rPr>
+        <w:t xml:space="preserve"> </w:t>
       </w:r>
       <w:r>
         <w:rPr>
@@ -8611,7 +8664,19 @@
         <w:rPr>
           <w:rFonts w:ascii="Times New Roman" w:hAnsi="Times New Roman" w:cs="Times New Roman"/>
         </w:rPr>
-        <w:t xml:space="preserve"> The simulated </w:t>
+        <w:t xml:space="preserve"> </w:t>
+      </w:r>
+      <w:r>
+        <w:rPr>
+          <w:rFonts w:ascii="Times New Roman" w:hAnsi="Times New Roman" w:cs="Times New Roman"/>
+        </w:rPr>
+        <w:t>t</w:t>
+      </w:r>
+      <w:r>
+        <w:rPr>
+          <w:rFonts w:ascii="Times New Roman" w:hAnsi="Times New Roman" w:cs="Times New Roman"/>
+        </w:rPr>
+        <w:t xml:space="preserve">he simulated </w:t>
       </w:r>
       <w:r>
         <w:rPr>
@@ -9201,14 +9266,14 @@
         </w:rPr>
         <w:t xml:space="preserve">the experiment from </w:t>
       </w:r>
-      <w:commentRangeStart w:id="3"/>
+      <w:commentRangeStart w:id="0"/>
       <w:r>
         <w:rPr>
           <w:rFonts w:ascii="Times New Roman" w:hAnsi="Times New Roman" w:cs="Times New Roman"/>
         </w:rPr>
         <w:t>before</w:t>
       </w:r>
-      <w:commentRangeEnd w:id="3"/>
+      <w:commentRangeEnd w:id="0"/>
       <w:r>
         <w:rPr>
           <w:rStyle w:val="Kommentarzeichen"/>
@@ -9216,7 +9281,7 @@
           <w:sz w:val="24"/>
           <w:szCs w:val="24"/>
         </w:rPr>
-        <w:commentReference w:id="3"/>
+        <w:commentReference w:id="0"/>
       </w:r>
       <w:r>
         <w:rPr>
@@ -9418,7 +9483,7 @@
         <w:rPr>
           <w:rFonts w:ascii="Times New Roman" w:hAnsi="Times New Roman" w:cs="Times New Roman"/>
         </w:rPr>
-        <w:t xml:space="preserve">For base_resp values of 0.5 and above, the </w:t>
+        <w:t xml:space="preserve">For base_resp of 0.5 and above, the </w:t>
       </w:r>
       <w:r>
         <w:rPr>
@@ -9474,14 +9539,14 @@
         </w:rPr>
         <w:t xml:space="preserve"> </w:t>
       </w:r>
-      <w:commentRangeStart w:id="4"/>
+      <w:commentRangeStart w:id="1"/>
       <w:r>
         <w:rPr>
           <w:rFonts w:ascii="Times New Roman" w:hAnsi="Times New Roman" w:cs="Times New Roman"/>
         </w:rPr>
         <w:t>Note that this procedure too is a form of multiple testing, so false positives and false negatives are likely to have happened.</w:t>
       </w:r>
-      <w:commentRangeEnd w:id="4"/>
+      <w:commentRangeEnd w:id="1"/>
       <w:r>
         <w:rPr>
           <w:rStyle w:val="Kommentarzeichen"/>
@@ -9489,7 +9554,7 @@
           <w:sz w:val="24"/>
           <w:szCs w:val="24"/>
         </w:rPr>
-        <w:commentReference w:id="4"/>
+        <w:commentReference w:id="1"/>
       </w:r>
     </w:p>
     <w:p>
@@ -10705,6 +10770,12 @@
         </w:rPr>
         <w:t>, 292–299. https://doi.org/10.1016/j.chb.2015.09.024</w:t>
       </w:r>
+      <w:r>
+        <w:rPr>
+          <w:rFonts w:ascii="Times New Roman" w:hAnsi="Times New Roman" w:cs="Times New Roman"/>
+        </w:rPr>
+        <w:t xml:space="preserve"> *</w:t>
+      </w:r>
     </w:p>
     <w:p>
       <w:pPr>
@@ -10747,6 +10818,12 @@
         </w:rPr>
         <w:t>(2), 434–443. https://doi.org/10.1016/j.chb.2011.10.014</w:t>
       </w:r>
+      <w:r>
+        <w:rPr>
+          <w:rFonts w:ascii="Times New Roman" w:hAnsi="Times New Roman" w:cs="Times New Roman"/>
+        </w:rPr>
+        <w:t xml:space="preserve"> *</w:t>
+      </w:r>
     </w:p>
     <w:p>
       <w:pPr>
@@ -10843,6 +10920,12 @@
         </w:rPr>
         <w:t>(6), 377–383. https://doi.org/10.1089/cyber.2022.0005</w:t>
       </w:r>
+      <w:r>
+        <w:rPr>
+          <w:rFonts w:ascii="Times New Roman" w:hAnsi="Times New Roman" w:cs="Times New Roman"/>
+        </w:rPr>
+        <w:t xml:space="preserve"> *</w:t>
+      </w:r>
     </w:p>
     <w:p>
       <w:pPr>
@@ -10968,6 +11051,12 @@
           <w:rFonts w:ascii="Times New Roman" w:hAnsi="Times New Roman" w:cs="Times New Roman"/>
         </w:rPr>
         <w:t>(5), 660–673. https://doi.org/10.1080/17439760.2022.2109203</w:t>
+      </w:r>
+      <w:r>
+        <w:rPr>
+          <w:rFonts w:ascii="Times New Roman" w:hAnsi="Times New Roman" w:cs="Times New Roman"/>
+        </w:rPr>
+        <w:t xml:space="preserve"> *</w:t>
       </w:r>
     </w:p>
     <w:p>
@@ -11004,21 +11093,8 @@
         <w:jc w:val="both"/>
         <w:rPr>
           <w:rFonts w:ascii="Times New Roman" w:hAnsi="Times New Roman" w:cs="Times New Roman"/>
-        </w:rPr>
-      </w:pPr>
-      <w:r>
-        <w:rPr>
-          <w:rFonts w:ascii="Times New Roman" w:hAnsi="Times New Roman" w:cs="Times New Roman"/>
-        </w:rPr>
-        <w:fldChar w:fldCharType="end"/>
-      </w:r>
-    </w:p>
-    <w:p>
-      <w:pPr>
-        <w:spacing w:line="360" w:lineRule="auto"/>
-        <w:jc w:val="both"/>
-        <w:rPr>
-          <w:rFonts w:ascii="Times New Roman" w:hAnsi="Times New Roman" w:cs="Times New Roman"/>
+          <w:b/>
+          <w:bCs/>
         </w:rPr>
         <w:sectPr>
           <w:pgSz w:w="11906" w:h="16838"/>
@@ -11027,6 +11103,51 @@
           <w:docGrid w:linePitch="360"/>
         </w:sectPr>
       </w:pPr>
+      <w:r>
+        <w:rPr>
+          <w:rFonts w:ascii="Times New Roman" w:hAnsi="Times New Roman" w:cs="Times New Roman"/>
+        </w:rPr>
+        <w:fldChar w:fldCharType="end"/>
+      </w:r>
+      <w:r>
+        <w:rPr>
+          <w:rFonts w:ascii="Times New Roman" w:hAnsi="Times New Roman" w:cs="Times New Roman"/>
+          <w:b/>
+          <w:bCs/>
+        </w:rPr>
+        <w:t>Note that r</w:t>
+      </w:r>
+      <w:r>
+        <w:rPr>
+          <w:rFonts w:ascii="Times New Roman" w:hAnsi="Times New Roman" w:cs="Times New Roman"/>
+          <w:b/>
+          <w:bCs/>
+        </w:rPr>
+        <w:t xml:space="preserve">eferences marked with * </w:t>
+      </w:r>
+      <w:r>
+        <w:rPr>
+          <w:rFonts w:ascii="Times New Roman" w:hAnsi="Times New Roman" w:cs="Times New Roman"/>
+          <w:b/>
+          <w:bCs/>
+        </w:rPr>
+        <w:t>were found with the use of</w:t>
+      </w:r>
+      <w:r>
+        <w:rPr>
+          <w:b/>
+          <w:bCs/>
+        </w:rPr>
+        <w:t xml:space="preserve"> </w:t>
+      </w:r>
+      <w:r>
+        <w:rPr>
+          <w:rFonts w:ascii="Times New Roman" w:hAnsi="Times New Roman" w:cs="Times New Roman"/>
+          <w:b/>
+          <w:bCs/>
+        </w:rPr>
+        <w:t>generative AI and AI-assisted technologies</w:t>
+      </w:r>
     </w:p>
     <w:p>
       <w:pPr>
@@ -13782,6 +13903,13 @@
         </w:rPr>
         <w:t>(n, p, i, r, c, …)</w:t>
       </w:r>
+      <w:r>
+        <w:rPr>
+          <w:rFonts w:ascii="Times New Roman" w:hAnsi="Times New Roman" w:cs="Times New Roman"/>
+          <w:i/>
+        </w:rPr>
+        <w:t xml:space="preserve"> </w:t>
+      </w:r>
     </w:p>
     <w:sectPr>
       <w:pgSz w:w="16838" w:h="11906" w:orient="landscape"/>
@@ -13795,7 +13923,7 @@
 
 <file path=word/comments.xml><?xml version="1.0" encoding="utf-8"?>
 <w:comments xmlns:wpc="http://schemas.microsoft.com/office/word/2010/wordprocessingCanvas" xmlns:cx="http://schemas.microsoft.com/office/drawing/2014/chartex" xmlns:cx1="http://schemas.microsoft.com/office/drawing/2015/9/8/chartex" xmlns:cx2="http://schemas.microsoft.com/office/drawing/2015/10/21/chartex" xmlns:cx3="http://schemas.microsoft.com/office/drawing/2016/5/9/chartex" xmlns:cx4="http://schemas.microsoft.com/office/drawing/2016/5/10/chartex" xmlns:cx5="http://schemas.microsoft.com/office/drawing/2016/5/11/chartex" xmlns:cx6="http://schemas.microsoft.com/office/drawing/2016/5/12/chartex" xmlns:cx7="http://schemas.microsoft.com/office/drawing/2016/5/13/chartex" xmlns:cx8="http://schemas.microsoft.com/office/drawing/2016/5/14/chartex" xmlns:mc="http://schemas.openxmlformats.org/markup-compatibility/2006" xmlns:aink="http://schemas.microsoft.com/office/drawing/2016/ink" xmlns:am3d="http://schemas.microsoft.com/office/drawing/2017/model3d" xmlns:o="urn:schemas-microsoft-com:office:office" xmlns:oel="http://schemas.microsoft.com/office/2019/extlst" xmlns:r="http://schemas.openxmlformats.org/officeDocument/2006/relationships" xmlns:m="http://schemas.openxmlformats.org/officeDocument/2006/math" xmlns:v="urn:schemas-microsoft-com:vml" xmlns:wp14="http://schemas.microsoft.com/office/word/2010/wordprocessingDrawing" xmlns:wp="http://schemas.openxmlformats.org/drawingml/2006/wordprocessingDrawing" xmlns:w10="urn:schemas-microsoft-com:office:word" xmlns:w="http://schemas.openxmlformats.org/wordprocessingml/2006/main" xmlns:w14="http://schemas.microsoft.com/office/word/2010/wordml" xmlns:w15="http://schemas.microsoft.com/office/word/2012/wordml" xmlns:w16cex="http://schemas.microsoft.com/office/word/2018/wordml/cex" xmlns:w16cid="http://schemas.microsoft.com/office/word/2016/wordml/cid" xmlns:w16="http://schemas.microsoft.com/office/word/2018/wordml" xmlns:w16du="http://schemas.microsoft.com/office/word/2023/wordml/word16du" xmlns:w16sdtdh="http://schemas.microsoft.com/office/word/2020/wordml/sdtdatahash" xmlns:w16sdtfl="http://schemas.microsoft.com/office/word/2024/wordml/sdtformatlock" xmlns:w16se="http://schemas.microsoft.com/office/word/2015/wordml/symex" xmlns:wpg="http://schemas.microsoft.com/office/word/2010/wordprocessingGroup" xmlns:wpi="http://schemas.microsoft.com/office/word/2010/wordprocessingInk" xmlns:wne="http://schemas.microsoft.com/office/word/2006/wordml" xmlns:wps="http://schemas.microsoft.com/office/word/2010/wordprocessingShape" mc:Ignorable="w14 w15 w16se w16cid w16 w16cex w16sdtdh w16sdtfl w16du wp14">
-  <w:comment w:id="0" w:author="Sofia Luchiean" w:date="2026-03-11T17:03:00Z" w:initials="SL">
+  <w:comment w:id="0" w:author="Sofia Luchiean" w:date="2026-03-15T16:51:00Z" w:initials="SL">
     <w:p>
       <w:pPr>
         <w:pStyle w:val="Kommentartext"/>
@@ -13813,109 +13941,23 @@
         <w:rPr>
           <w:lang w:val="de-DE"/>
         </w:rPr>
-        <w:t>Schöner sagen</w:t>
+        <w:t>Zu Absatznummer ändern vo</w:t>
+      </w:r>
+      <w:r>
+        <w:rPr>
+          <w:lang w:val="de-DE"/>
+        </w:rPr>
+        <w:t>m letzten A</w:t>
+      </w:r>
+      <w:r>
+        <w:rPr>
+          <w:lang w:val="de-DE"/>
+        </w:rPr>
+        <w:t>bsatz (oder zu dessen Namen)</w:t>
       </w:r>
     </w:p>
   </w:comment>
-  <w:comment w:id="1" w:author="Sofia Luchiean" w:date="2026-03-17T09:01:00Z" w:initials="SL">
-    <w:p>
-      <w:pPr>
-        <w:pStyle w:val="Kommentartext"/>
-        <w:rPr>
-          <w:lang w:val="de-DE"/>
-        </w:rPr>
-      </w:pPr>
-      <w:r>
-        <w:rPr>
-          <w:rStyle w:val="Kommentarzeichen"/>
-        </w:rPr>
-        <w:annotationRef/>
-      </w:r>
-      <w:r>
-        <w:rPr>
-          <w:lang w:val="de-DE"/>
-        </w:rPr>
-        <w:t>Die beiden Sätze nochmal überdenken</w:t>
-      </w:r>
-    </w:p>
-    <w:p>
-      <w:pPr>
-        <w:pStyle w:val="Kommentartext"/>
-        <w:rPr>
-          <w:lang w:val="de-DE"/>
-        </w:rPr>
-      </w:pPr>
-    </w:p>
-  </w:comment>
-  <w:comment w:id="2" w:author="Sofia Luchiean" w:date="2026-03-14T20:07:00Z" w:initials="SL">
-    <w:p>
-      <w:pPr>
-        <w:pStyle w:val="Kommentartext"/>
-        <w:rPr>
-          <w:lang w:val="de-DE"/>
-        </w:rPr>
-      </w:pPr>
-      <w:r>
-        <w:rPr>
-          <w:rStyle w:val="Kommentarzeichen"/>
-        </w:rPr>
-        <w:annotationRef/>
-      </w:r>
-      <w:r>
-        <w:rPr>
-          <w:lang w:val="de-DE"/>
-        </w:rPr>
-        <w:t>R</w:t>
-      </w:r>
-      <w:r>
-        <w:rPr>
-          <w:lang w:val="de-DE"/>
-        </w:rPr>
-        <w:t>, RStudio und R</w:t>
-      </w:r>
-      <w:r>
-        <w:rPr>
-          <w:lang w:val="de-DE"/>
-        </w:rPr>
-        <w:t>-Pakete zitieren</w:t>
-      </w:r>
-    </w:p>
-  </w:comment>
-  <w:comment w:id="3" w:author="Sofia Luchiean" w:date="2026-03-15T16:51:00Z" w:initials="SL">
-    <w:p>
-      <w:pPr>
-        <w:pStyle w:val="Kommentartext"/>
-        <w:rPr>
-          <w:lang w:val="de-DE"/>
-        </w:rPr>
-      </w:pPr>
-      <w:r>
-        <w:rPr>
-          <w:rStyle w:val="Kommentarzeichen"/>
-        </w:rPr>
-        <w:annotationRef/>
-      </w:r>
-      <w:r>
-        <w:rPr>
-          <w:lang w:val="de-DE"/>
-        </w:rPr>
-        <w:t>Zu Absatznummer ändern vo</w:t>
-      </w:r>
-      <w:r>
-        <w:rPr>
-          <w:lang w:val="de-DE"/>
-        </w:rPr>
-        <w:t>m letzten A</w:t>
-      </w:r>
-      <w:r>
-        <w:rPr>
-          <w:lang w:val="de-DE"/>
-        </w:rPr>
-        <w:t>bsatz (oder zu dessen Namen)</w:t>
-      </w:r>
-    </w:p>
-  </w:comment>
-  <w:comment w:id="4" w:author="Sofia Luchiean" w:date="2026-03-15T17:09:00Z" w:initials="SL">
+  <w:comment w:id="1" w:author="Sofia Luchiean" w:date="2026-03-15T17:09:00Z" w:initials="SL">
     <w:p>
       <w:pPr>
         <w:pStyle w:val="Kommentartext"/>
@@ -13948,9 +13990,6 @@
 
 <file path=word/commentsExtended.xml><?xml version="1.0" encoding="utf-8"?>
 <w15:commentsEx xmlns:wpc="http://schemas.microsoft.com/office/word/2010/wordprocessingCanvas" xmlns:cx="http://schemas.microsoft.com/office/drawing/2014/chartex" xmlns:cx1="http://schemas.microsoft.com/office/drawing/2015/9/8/chartex" xmlns:cx2="http://schemas.microsoft.com/office/drawing/2015/10/21/chartex" xmlns:cx3="http://schemas.microsoft.com/office/drawing/2016/5/9/chartex" xmlns:cx4="http://schemas.microsoft.com/office/drawing/2016/5/10/chartex" xmlns:cx5="http://schemas.microsoft.com/office/drawing/2016/5/11/chartex" xmlns:cx6="http://schemas.microsoft.com/office/drawing/2016/5/12/chartex" xmlns:cx7="http://schemas.microsoft.com/office/drawing/2016/5/13/chartex" xmlns:cx8="http://schemas.microsoft.com/office/drawing/2016/5/14/chartex" xmlns:mc="http://schemas.openxmlformats.org/markup-compatibility/2006" xmlns:aink="http://schemas.microsoft.com/office/drawing/2016/ink" xmlns:am3d="http://schemas.microsoft.com/office/drawing/2017/model3d" xmlns:o="urn:schemas-microsoft-com:office:office" xmlns:oel="http://schemas.microsoft.com/office/2019/extlst" xmlns:r="http://schemas.openxmlformats.org/officeDocument/2006/relationships" xmlns:m="http://schemas.openxmlformats.org/officeDocument/2006/math" xmlns:v="urn:schemas-microsoft-com:vml" xmlns:wp14="http://schemas.microsoft.com/office/word/2010/wordprocessingDrawing" xmlns:wp="http://schemas.openxmlformats.org/drawingml/2006/wordprocessingDrawing" xmlns:w10="urn:schemas-microsoft-com:office:word" xmlns:w="http://schemas.openxmlformats.org/wordprocessingml/2006/main" xmlns:w14="http://schemas.microsoft.com/office/word/2010/wordml" xmlns:w15="http://schemas.microsoft.com/office/word/2012/wordml" xmlns:w16cex="http://schemas.microsoft.com/office/word/2018/wordml/cex" xmlns:w16cid="http://schemas.microsoft.com/office/word/2016/wordml/cid" xmlns:w16="http://schemas.microsoft.com/office/word/2018/wordml" xmlns:w16du="http://schemas.microsoft.com/office/word/2023/wordml/word16du" xmlns:w16sdtdh="http://schemas.microsoft.com/office/word/2020/wordml/sdtdatahash" xmlns:w16sdtfl="http://schemas.microsoft.com/office/word/2024/wordml/sdtformatlock" xmlns:w16se="http://schemas.microsoft.com/office/word/2015/wordml/symex" xmlns:wpg="http://schemas.microsoft.com/office/word/2010/wordprocessingGroup" xmlns:wpi="http://schemas.microsoft.com/office/word/2010/wordprocessingInk" xmlns:wne="http://schemas.microsoft.com/office/word/2006/wordml" xmlns:wps="http://schemas.microsoft.com/office/word/2010/wordprocessingShape" mc:Ignorable="w14 w15 w16se w16cid w16 w16cex w16sdtdh w16sdtfl w16du wp14">
-  <w15:commentEx w15:paraId="40F8C749" w15:done="0"/>
-  <w15:commentEx w15:paraId="6505B738" w15:done="0"/>
-  <w15:commentEx w15:paraId="719A1428" w15:done="0"/>
   <w15:commentEx w15:paraId="59C88819" w15:done="0"/>
   <w15:commentEx w15:paraId="01732096" w15:done="0"/>
 </w15:commentsEx>
@@ -13958,9 +13997,6 @@
 
 <file path=word/commentsExtensible.xml><?xml version="1.0" encoding="utf-8"?>
 <w16cex:commentsExtensible xmlns:wpc="http://schemas.microsoft.com/office/word/2010/wordprocessingCanvas" xmlns:cx="http://schemas.microsoft.com/office/drawing/2014/chartex" xmlns:cx1="http://schemas.microsoft.com/office/drawing/2015/9/8/chartex" xmlns:cx2="http://schemas.microsoft.com/office/drawing/2015/10/21/chartex" xmlns:cx3="http://schemas.microsoft.com/office/drawing/2016/5/9/chartex" xmlns:cx4="http://schemas.microsoft.com/office/drawing/2016/5/10/chartex" xmlns:cx5="http://schemas.microsoft.com/office/drawing/2016/5/11/chartex" xmlns:cx6="http://schemas.microsoft.com/office/drawing/2016/5/12/chartex" xmlns:cx7="http://schemas.microsoft.com/office/drawing/2016/5/13/chartex" xmlns:cx8="http://schemas.microsoft.com/office/drawing/2016/5/14/chartex" xmlns:cr="http://schemas.microsoft.com/office/comments/2020/reactions" xmlns:mc="http://schemas.openxmlformats.org/markup-compatibility/2006" xmlns:aink="http://schemas.microsoft.com/office/drawing/2016/ink" xmlns:am3d="http://schemas.microsoft.com/office/drawing/2017/model3d" xmlns:o="urn:schemas-microsoft-com:office:office" xmlns:oel="http://schemas.microsoft.com/office/2019/extlst" xmlns:r="http://schemas.openxmlformats.org/officeDocument/2006/relationships" xmlns:m="http://schemas.openxmlformats.org/officeDocument/2006/math" xmlns:v="urn:schemas-microsoft-com:vml" xmlns:wp14="http://schemas.microsoft.com/office/word/2010/wordprocessingDrawing" xmlns:wp="http://schemas.openxmlformats.org/drawingml/2006/wordprocessingDrawing" xmlns:w10="urn:schemas-microsoft-com:office:word" xmlns:w="http://schemas.openxmlformats.org/wordprocessingml/2006/main" xmlns:w14="http://schemas.microsoft.com/office/word/2010/wordml" xmlns:w15="http://schemas.microsoft.com/office/word/2012/wordml" xmlns:w16cex="http://schemas.microsoft.com/office/word/2018/wordml/cex" xmlns:w16cid="http://schemas.microsoft.com/office/word/2016/wordml/cid" xmlns:w16="http://schemas.microsoft.com/office/word/2018/wordml" xmlns:w16du="http://schemas.microsoft.com/office/word/2023/wordml/word16du" xmlns:w16sdtdh="http://schemas.microsoft.com/office/word/2020/wordml/sdtdatahash" xmlns:w16sdtfl="http://schemas.microsoft.com/office/word/2024/wordml/sdtformatlock" xmlns:w16se="http://schemas.microsoft.com/office/word/2015/wordml/symex" xmlns:wpg="http://schemas.microsoft.com/office/word/2010/wordprocessingGroup" xmlns:wpi="http://schemas.microsoft.com/office/word/2010/wordprocessingInk" xmlns:wne="http://schemas.microsoft.com/office/word/2006/wordml" xmlns:wps="http://schemas.microsoft.com/office/word/2010/wordprocessingShape" mc:Ignorable="w14 w15 w16se w16cid w16 w16cex w16sdtdh w16sdtfl cr w16du wp14">
-  <w16cex:commentExtensible w16cex:durableId="1EE80C84" w16cex:dateUtc="2026-03-11T16:03:00Z"/>
-  <w16cex:commentExtensible w16cex:durableId="45EF25AF" w16cex:dateUtc="2026-03-17T08:01:00Z"/>
-  <w16cex:commentExtensible w16cex:durableId="44893CDD" w16cex:dateUtc="2026-03-14T19:07:00Z"/>
   <w16cex:commentExtensible w16cex:durableId="25B2C7A5" w16cex:dateUtc="2026-03-15T15:51:00Z"/>
   <w16cex:commentExtensible w16cex:durableId="6A418467" w16cex:dateUtc="2026-03-15T16:09:00Z"/>
 </w16cex:commentsExtensible>
@@ -13968,9 +14004,6 @@
 
 <file path=word/commentsIds.xml><?xml version="1.0" encoding="utf-8"?>
 <w16cid:commentsIds xmlns:wpc="http://schemas.microsoft.com/office/word/2010/wordprocessingCanvas" xmlns:cx="http://schemas.microsoft.com/office/drawing/2014/chartex" xmlns:cx1="http://schemas.microsoft.com/office/drawing/2015/9/8/chartex" xmlns:cx2="http://schemas.microsoft.com/office/drawing/2015/10/21/chartex" xmlns:cx3="http://schemas.microsoft.com/office/drawing/2016/5/9/chartex" xmlns:cx4="http://schemas.microsoft.com/office/drawing/2016/5/10/chartex" xmlns:cx5="http://schemas.microsoft.com/office/drawing/2016/5/11/chartex" xmlns:cx6="http://schemas.microsoft.com/office/drawing/2016/5/12/chartex" xmlns:cx7="http://schemas.microsoft.com/office/drawing/2016/5/13/chartex" xmlns:cx8="http://schemas.microsoft.com/office/drawing/2016/5/14/chartex" xmlns:mc="http://schemas.openxmlformats.org/markup-compatibility/2006" xmlns:aink="http://schemas.microsoft.com/office/drawing/2016/ink" xmlns:am3d="http://schemas.microsoft.com/office/drawing/2017/model3d" xmlns:o="urn:schemas-microsoft-com:office:office" xmlns:oel="http://schemas.microsoft.com/office/2019/extlst" xmlns:r="http://schemas.openxmlformats.org/officeDocument/2006/relationships" xmlns:m="http://schemas.openxmlformats.org/officeDocument/2006/math" xmlns:v="urn:schemas-microsoft-com:vml" xmlns:wp14="http://schemas.microsoft.com/office/word/2010/wordprocessingDrawing" xmlns:wp="http://schemas.openxmlformats.org/drawingml/2006/wordprocessingDrawing" xmlns:w10="urn:schemas-microsoft-com:office:word" xmlns:w="http://schemas.openxmlformats.org/wordprocessingml/2006/main" xmlns:w14="http://schemas.microsoft.com/office/word/2010/wordml" xmlns:w15="http://schemas.microsoft.com/office/word/2012/wordml" xmlns:w16cex="http://schemas.microsoft.com/office/word/2018/wordml/cex" xmlns:w16cid="http://schemas.microsoft.com/office/word/2016/wordml/cid" xmlns:w16="http://schemas.microsoft.com/office/word/2018/wordml" xmlns:w16du="http://schemas.microsoft.com/office/word/2023/wordml/word16du" xmlns:w16sdtdh="http://schemas.microsoft.com/office/word/2020/wordml/sdtdatahash" xmlns:w16sdtfl="http://schemas.microsoft.com/office/word/2024/wordml/sdtformatlock" xmlns:w16se="http://schemas.microsoft.com/office/word/2015/wordml/symex" xmlns:wpg="http://schemas.microsoft.com/office/word/2010/wordprocessingGroup" xmlns:wpi="http://schemas.microsoft.com/office/word/2010/wordprocessingInk" xmlns:wne="http://schemas.microsoft.com/office/word/2006/wordml" xmlns:wps="http://schemas.microsoft.com/office/word/2010/wordprocessingShape" mc:Ignorable="w14 w15 w16se w16cid w16 w16cex w16sdtdh w16sdtfl w16du wp14">
-  <w16cid:commentId w16cid:paraId="40F8C749" w16cid:durableId="1EE80C84"/>
-  <w16cid:commentId w16cid:paraId="6505B738" w16cid:durableId="45EF25AF"/>
-  <w16cid:commentId w16cid:paraId="719A1428" w16cid:durableId="44893CDD"/>
   <w16cid:commentId w16cid:paraId="59C88819" w16cid:durableId="25B2C7A5"/>
   <w16cid:commentId w16cid:paraId="01732096" w16cid:durableId="6A418467"/>
 </w16cid:commentsIds>
@@ -14036,6 +14069,7 @@
         <w:docPartUnique/>
       </w:docPartObj>
     </w:sdtPr>
+    <w:sdtEndPr/>
     <w:sdtContent>
       <w:p>
         <w:pPr>

</xml_diff>